<commit_message>
Add GitHub repo link to both workbook editions
Both the Polish and English workbook now point readers back to this
repo for the runnable code, instead of leaving them to retype it from
the page.
</commit_message>
<xml_diff>
--- a/Digital_Twin_from_Scratch_Workbook_EN.docx
+++ b/Digital_Twin_from_Scratch_Workbook_EN.docx
@@ -240,6 +240,17 @@
           <w:rStyle w:val="NormalTok"/>
         </w:rPr>
         <w:t xml:space="preserve"> install numpy pandas scikit-learn matplotlib torch fastapi uvicorn</w:t>
+      </w:r>
+    </w:p>
+    <w:p>
+      <w:pPr>
+        <w:pStyle w:val="BodyText"/>
+      </w:pPr>
+      <w:r>
+        <w:rPr>
+          <w:i/>
+        </w:rPr>
+        <w:t xml:space="preserve">This workbook’s code lives on GitHub, at github.com/jackfischer3000/DIGITAL-TWIN-OD-ZERA-Practical-Workbook, in both Polish and English — pull it directly instead of retyping from the page, and check there for updates or corrections.</w:t>
       </w:r>
     </w:p>
     <w:p>

</xml_diff>

<commit_message>
Add a "How to Use This Workbook" section and connect scenario to code
Both editions get a new front-matter section covering how to organize
exercise work (copy the script before editing, keep short notes, do
exercises before moving on) and which parts to slow down on depending
on the reader's background.

Chapters 1-6, 13, and 14 also get a few sentences between the scenario
and the code block instead of jumping straight from a one-paragraph
setup into a wall of code: what the code is about to do, and a
concrete "open this file, run it, look for this" instruction.
</commit_message>
<xml_diff>
--- a/Digital_Twin_from_Scratch_Workbook_EN.docx
+++ b/Digital_Twin_from_Scratch_Workbook_EN.docx
@@ -258,6 +258,158 @@
         <w:pStyle w:val="FirstParagraph"/>
       </w:pPr>
       <w:r>
+        <w:t xml:space="preserve">How to Use This Workbook</w:t>
+      </w:r>
+    </w:p>
+    <w:p>
+      <w:pPr>
+        <w:pStyle w:val="BodyText"/>
+        <w:ind w:left="200"/>
+      </w:pPr>
+      <w:r>
+        <w:t xml:space="preserve">— </w:t>
+      </w:r>
+      <w:r>
+        <w:rPr>
+          <w:b/>
+        </w:rPr>
+        <w:t xml:space="preserve">Run the code yourself, don't just read it.</w:t>
+      </w:r>
+      <w:r>
+        <w:t xml:space="preserve"> Reading code alone gives a false sense of understanding — it only really lands once you see the result on your own screen.</w:t>
+      </w:r>
+    </w:p>
+    <w:p>
+      <w:pPr>
+        <w:pStyle w:val="BodyText"/>
+        <w:ind w:left="200"/>
+      </w:pPr>
+      <w:r>
+        <w:t xml:space="preserve">— </w:t>
+      </w:r>
+      <w:r>
+        <w:rPr>
+          <w:b/>
+        </w:rPr>
+        <w:t xml:space="preserve">Before an exercise, copy the chapter's script</w:t>
+      </w:r>
+      <w:r>
+        <w:t xml:space="preserve"> — e.g. model.py → exercise_1.py — and work on the copy. The original stays untouched, so you can always go back and compare what changed.</w:t>
+      </w:r>
+    </w:p>
+    <w:p>
+      <w:pPr>
+        <w:pStyle w:val="BodyText"/>
+        <w:ind w:left="200"/>
+      </w:pPr>
+      <w:r>
+        <w:t xml:space="preserve">— </w:t>
+      </w:r>
+      <w:r>
+        <w:rPr>
+          <w:b/>
+        </w:rPr>
+        <w:t xml:space="preserve">Keep short notes</w:t>
+      </w:r>
+      <w:r>
+        <w:t xml:space="preserve"> (even one notes.md file) — after each exercise, write one sentence on what you expected versus what actually happened. That gap is where the learning is, not the act of running the code.</w:t>
+      </w:r>
+    </w:p>
+    <w:p>
+      <w:pPr>
+        <w:pStyle w:val="BodyText"/>
+        <w:ind w:left="200"/>
+      </w:pPr>
+      <w:r>
+        <w:t xml:space="preserve">— </w:t>
+      </w:r>
+      <w:r>
+        <w:rPr>
+          <w:b/>
+        </w:rPr>
+        <w:t xml:space="preserve">Do the exercises before moving on,</w:t>
+      </w:r>
+      <w:r>
+        <w:t xml:space="preserve"> not at the end — they're designed to confront you with a question before the book answers it in the next chapter.</w:t>
+      </w:r>
+    </w:p>
+    <w:p>
+      <w:pPr>
+        <w:pStyle w:val="BodyText"/>
+        <w:ind w:left="200"/>
+      </w:pPr>
+      <w:r>
+        <w:t xml:space="preserve">— </w:t>
+      </w:r>
+      <w:r>
+        <w:rPr>
+          <w:b/>
+        </w:rPr>
+        <w:t xml:space="preserve">There's no answer key — on purpose.</w:t>
+      </w:r>
+      <w:r>
+        <w:t xml:space="preserve"> The exercises test intuition, not a specific number. If you get stuck, go back to that chapter's “What Comes Out of This” section — the exercise usually changes just one thing that section already explained.</w:t>
+      </w:r>
+    </w:p>
+    <w:p>
+      <w:pPr>
+        <w:pStyle w:val="BodyText"/>
+        <w:ind w:left="200"/>
+      </w:pPr>
+      <w:r>
+        <w:t xml:space="preserve">— </w:t>
+      </w:r>
+      <w:r>
+        <w:rPr>
+          <w:b/>
+        </w:rPr>
+        <w:t xml:space="preserve">Two paths, one book.</w:t>
+      </w:r>
+      <w:r>
+        <w:t xml:space="preserve"> Process engineer: slow down through Chapters 1–5 (ML fundamentals). Data scientist: slow down through Part II (MDS, DQ, OQ, PQ) — that's where the regulatory logic lives.</w:t>
+      </w:r>
+    </w:p>
+    <w:p>
+      <w:pPr>
+        <w:pStyle w:val="BodyText"/>
+        <w:ind w:left="200"/>
+      </w:pPr>
+      <w:r>
+        <w:t xml:space="preserve">— </w:t>
+      </w:r>
+      <w:r>
+        <w:rPr>
+          <w:b/>
+        </w:rPr>
+        <w:t xml:space="preserve">You don't need to do every exercise properly</w:t>
+      </w:r>
+      <w:r>
+        <w:t xml:space="preserve"> — one or two per chapter is enough to keep moving; you can come back for the rest later.</w:t>
+      </w:r>
+    </w:p>
+    <w:p>
+      <w:pPr>
+        <w:pStyle w:val="BodyText"/>
+        <w:ind w:left="200"/>
+      </w:pPr>
+      <w:r>
+        <w:t xml:space="preserve">— </w:t>
+      </w:r>
+      <w:r>
+        <w:rPr>
+          <w:b/>
+        </w:rPr>
+        <w:t xml:space="preserve">When something doesn't work:</w:t>
+      </w:r>
+      <w:r>
+        <w:t xml:space="preserve"> check your Python version (3.11+) and your venv first. The real failures described in the text are part of the material — if you reproduce one, that's a good sign.</w:t>
+      </w:r>
+    </w:p>
+    <w:p>
+      <w:pPr>
+        <w:pStyle w:val="FirstParagraph"/>
+      </w:pPr>
+      <w:r>
         <w:t xml:space="preserve">How This Is Organized</w:t>
       </w:r>
     </w:p>
@@ -350,7 +502,7 @@
         <w:pStyle w:val="BodyText"/>
       </w:pPr>
       <w:r>
-        <w:t xml:space="preserve">We invent a reactor in which temperature depends linearly on heater power and process duration — with known coefficients: temperature = 20 + 1.8×power + 0.15×time + noise. The model, of course, doesn’t see this formula. It gets raw input and output data and has to discover these coefficients itself.</w:t>
+        <w:t xml:space="preserve">We invent a reactor in which temperature depends linearly on heater power and process duration — with known coefficients: temperature = 20 + 1.8×power + 0.15×time + noise. The model, of course, doesn’t see this formula. It gets raw input and output data and has to discover these coefficients itself. The whole process is the same five steps every supervised model goes through, no matter how complicated it gets later: build a dataset, hold out part of it for testing, fit the model on the rest, evaluate it on the held-out part, and interpret the result. Everything from here through Chapter 14 is a variation on these same five steps.</w:t>
       </w:r>
     </w:p>
     <w:p>
@@ -2660,7 +2812,7 @@
         <w:pStyle w:val="FirstParagraph"/>
       </w:pPr>
       <w:r>
-        <w:t xml:space="preserve">Linear regression can only find a straight line. Plenty of processes don’t behave that way — a heater, for example, has a diminishing effect at high power, because saturation sets in. This chapter shows how to even recognize this problem before reaching for a heavier architecture, and why a neural network solves it.</w:t>
+        <w:t xml:space="preserve">Linear regression can only find a straight line. Plenty of processes don’t behave that way — a heater, for example, has a diminishing effect at high power, because saturation sets in. This chapter shows how to even recognize this problem before reaching for a heavier architecture, and why a neural network solves it. You’ll see it on two models at once: the same linear regression from Chapter 1, and a new, small neural network, on the same data. Open a new file, e.g. model.py, copy the code below in full, and run it with python3 model.py — compare the printed RMSE of both models. If the neural network comes out worse than the regression, that’s a sign something’s off with the configuration, not that neural networks themselves don’t work — go back to the “Two Things That Came Up Along the Way” section below before you start debugging on your own.</w:t>
       </w:r>
     </w:p>
     <w:p>
@@ -4884,7 +5036,7 @@
         <w:pStyle w:val="FirstParagraph"/>
       </w:pPr>
       <w:r>
-        <w:t xml:space="preserve">This is the same architecture as in the bioreactor case study from the main book (Chapter 6, D.1) — just on a simpler example. Instead of choosing between physics and machine learning, we combine them: a physical model (mass balance, known equations) explains most of the phenomenon, and the ML learns only from what the physics doesn’t explain. This is a much easier task than learning everything from scratch, and — as you’ll see shortly — safer.</w:t>
+        <w:t xml:space="preserve">This is the same architecture as in the bioreactor case study from the main book (Chapter 6, D.1) — just on a simpler example. Instead of choosing between physics and machine learning, we combine them: a physical model (mass balance, known equations) explains most of the phenomenon, and the ML learns only from what the physics doesn’t explain. This is a much easier task than learning everything from scratch, and — as you’ll see shortly — safer. We’ll build three approaches on the same data — physics only, ML only, and the hybrid — so you see the difference with your own eyes, not just take it on faith. Open a new file, paste the whole code below, run it, and note the three RMSE values it prints — you’ll need them shortly, for the failure that actually happened while building this chapter.</w:t>
       </w:r>
     </w:p>
     <w:p>
@@ -8216,7 +8368,7 @@
         <w:pStyle w:val="FirstParagraph"/>
       </w:pPr>
       <w:r>
-        <w:t xml:space="preserve">A classic of the genre: we fit polynomials of increasing degree to a small, noisy dataset (n=25, deliberately small, because that way overfitting is obvious at a glance, not something you have to guess at).</w:t>
+        <w:t xml:space="preserve">A classic of the genre: we fit polynomials of increasing degree to a small, noisy dataset (n=25, deliberately small, because that way overfitting is obvious at a glance, not something you have to guess at). You’ll see it on one dataset, fitting polynomials of six different degrees — from too simple to absurdly complex. Paste the code below into a new file and run it, then look at the two columns it prints: training RMSE and test RMSE, and how far apart they drift at higher degrees — that’s the exact moment overfitting becomes visible with your own eyes, not just in theory.</w:t>
       </w:r>
     </w:p>
     <w:p>
@@ -11242,7 +11394,7 @@
         <w:pStyle w:val="FirstParagraph"/>
       </w:pPr>
       <w:r>
-        <w:t xml:space="preserve">Processes with inertia — thermal, mechanical, biological, it doesn’t matter which — have a state that depends on history, not just on what’s happening right now. We simulate a reactor with thermal inertia and look at why a model with no access to the previous state is systematically wrong. This is, in essence, the whole reason we reach for a GRU in Part II.</w:t>
+        <w:t xml:space="preserve">Processes with inertia — thermal, mechanical, biological, it doesn’t matter which — have a state that depends on history, not just on what’s happening right now. We simulate a reactor with thermal inertia and look at why a model with no access to the previous state is systematically wrong. This is, in essence, the whole reason we reach for a GRU in Part II. We’ll build two models on the same time series — one without memory, one with — and compare their error. Paste the code below into a new file, run it, and note the percentage RMSE difference between model A and model B printed at the end — that’s the number we’ll come back to when motivating GRU in Part II.</w:t>
       </w:r>
     </w:p>
     <w:p>
@@ -14355,7 +14507,7 @@
         <w:t xml:space="preserve">“metabolic overflow mode”</w:t>
       </w:r>
       <w:r>
-        <w:t xml:space="preserve">: when the cumulative combination of biomass density and feeding history crosses a threshold, the cells start consuming more oxygen (qO2 increases 1.7-fold). This is exactly the mechanism I wrote about in the Introduction of the main book — inoculum density and feeding history lead to a delayed DO drop, and to catch this, the model needs memory, not just a view of current values. Hence the GRU.</w:t>
+        <w:t xml:space="preserve">: when the cumulative combination of biomass density and feeding history crosses a threshold, the cells start consuming more oxygen (qO2 increases 1.7-fold). This is exactly the mechanism I wrote about in the Introduction of the main book — inoculum density and feeding history lead to a delayed DO drop, and to catch this, the model needs memory, not just a view of current values. Hence the GRU. The code below builds exactly this simulation — open a new file symulacja_en.py, copy it in full, and run it with python3 symulacja_en.py. Notice the metabolic_mode variable in the output: it’s only in the data for inspection — no model we build later ever gets it as an input, exactly as it would be at a real plant, where you wouldn’t be measuring that quantity at all.</w:t>
       </w:r>
     </w:p>
     <w:p>
@@ -26878,7 +27030,7 @@
         <w:pStyle w:val="BodyText"/>
       </w:pPr>
       <w:r>
-        <w:t xml:space="preserve">GRU weights, scaling statistics, the conformal prediction quantile, Mahalanobis statistics, the training-data hash from Chapter 8 — all to disk, before we write even one line of the API itself.</w:t>
+        <w:t xml:space="preserve">GRU weights, scaling statistics, the conformal prediction quantile, Mahalanobis statistics, the training-data hash from Chapter 8 — all to disk, before we write even one line of the API itself. Run the script below as its own file, trenuj_i_zapisz_en.py — it trains the model from scratch (exactly as in Chapter 6) and saves two output files: model_gru_en.pt with the network weights, and artefakty_en.json with every number the API in the next section will need. Check in the printout that the quantile and the OOD threshold match the ones from Chapters 9 and 11 — if they do, you know the pipeline is consistent from training through to deployment.</w:t>
       </w:r>
     </w:p>
     <w:p>
@@ -31072,7 +31224,7 @@
         <w:pStyle w:val="BodyText"/>
       </w:pPr>
       <w:r>
-        <w:t xml:space="preserve">The POST /predict endpoint returns exactly what we promised in the MDS: a prediction with a confidence interval, the OOD flag, the model version, and along with that the physics/ML-correction breakdown and the fallback logic.</w:t>
+        <w:t xml:space="preserve">The POST /predict endpoint returns exactly what we promised in the MDS: a prediction with a confidence interval, the OOD flag, the model version, and along with that the physics/ML-correction breakdown and the fallback logic. Save the code below as api_en.py in the same directory as the artefakty_en.json from the previous step, then start the server with uvicorn api_en:app --port 8000. Leave that terminal running — in the next section we’ll send it two real requests, one inside the normal data range, one deliberately outside it, to see the fallback in action.</w:t>
       </w:r>
     </w:p>
     <w:p>
@@ -35915,7 +36067,7 @@
         <w:t xml:space="preserve"> </w:t>
       </w:r>
       <w:r>
-        <w:t xml:space="preserve">This whole cycle is an investment — of team time, infrastructure, the regulatory process. This chapter shows how to translate it into numbers that speak to finance, not just to engineers.</w:t>
+        <w:t xml:space="preserve">This whole cycle is an investment — of team time, infrastructure, the regulatory process. This chapter shows how to translate it into numbers that speak to finance, not just to engineers. We’ll build this as a small, self-contained Python module — not a spreadsheet — so you can plug it into your next project, not just this one example. Paste the code below into a new file, kalkulator_roi_en.py, run it, and compare the printed payback period against the number quoted in the section below — they should match to the month.</w:t>
       </w:r>
     </w:p>
     <w:p>

</xml_diff>